<commit_message>
Final revision for PLOS ONE
Updated Bayesian approach incorporating OxCal charcoal outlier models and Monte Carlo simulations; updated quarto manuscript, tables and figures
</commit_message>
<xml_diff>
--- a/esm/esm_2_Technical_descriptions.docx
+++ b/esm/esm_2_Technical_descriptions.docx
@@ -370,6 +370,7 @@
                 <w:szCs w:val="16"/>
               </w:rPr>
             </w:pPr>
+            <w:proofErr w:type="spellStart"/>
             <w:r>
               <w:rPr>
                 <w:rFonts w:ascii="Arial" w:hAnsi="Arial" w:cs="Arial"/>
@@ -380,6 +381,7 @@
               </w:rPr>
               <w:t>Taxa</w:t>
             </w:r>
+            <w:proofErr w:type="spellEnd"/>
           </w:p>
         </w:tc>
         <w:tc>
@@ -398,6 +400,7 @@
                 <w:szCs w:val="16"/>
               </w:rPr>
             </w:pPr>
+            <w:proofErr w:type="spellStart"/>
             <w:r>
               <w:rPr>
                 <w:rFonts w:ascii="Arial" w:hAnsi="Arial" w:cs="Arial"/>
@@ -406,7 +409,40 @@
                 <w:sz w:val="16"/>
                 <w:szCs w:val="16"/>
               </w:rPr>
-              <w:t>Lifespan (years) *</w:t>
+              <w:t>Lifespan</w:t>
+            </w:r>
+            <w:proofErr w:type="spellEnd"/>
+            <w:r>
+              <w:rPr>
+                <w:rFonts w:ascii="Arial" w:hAnsi="Arial" w:cs="Arial"/>
+                <w:b/>
+                <w:bCs/>
+                <w:sz w:val="16"/>
+                <w:szCs w:val="16"/>
+              </w:rPr>
+              <w:t xml:space="preserve"> (</w:t>
+            </w:r>
+            <w:proofErr w:type="spellStart"/>
+            <w:r>
+              <w:rPr>
+                <w:rFonts w:ascii="Arial" w:hAnsi="Arial" w:cs="Arial"/>
+                <w:b/>
+                <w:bCs/>
+                <w:sz w:val="16"/>
+                <w:szCs w:val="16"/>
+              </w:rPr>
+              <w:t>years</w:t>
+            </w:r>
+            <w:proofErr w:type="spellEnd"/>
+            <w:r>
+              <w:rPr>
+                <w:rFonts w:ascii="Arial" w:hAnsi="Arial" w:cs="Arial"/>
+                <w:b/>
+                <w:bCs/>
+                <w:sz w:val="16"/>
+                <w:szCs w:val="16"/>
+              </w:rPr>
+              <w:t>) *</w:t>
             </w:r>
           </w:p>
         </w:tc>
@@ -426,6 +462,7 @@
                 <w:szCs w:val="16"/>
               </w:rPr>
             </w:pPr>
+            <w:proofErr w:type="spellStart"/>
             <w:r>
               <w:rPr>
                 <w:rFonts w:ascii="Arial" w:hAnsi="Arial" w:cs="Arial"/>
@@ -436,6 +473,7 @@
               </w:rPr>
               <w:t>Context</w:t>
             </w:r>
+            <w:proofErr w:type="spellEnd"/>
           </w:p>
         </w:tc>
         <w:tc>
@@ -495,7 +533,31 @@
                 <w:szCs w:val="16"/>
                 <w:lang w:val="es-ES_tradnl"/>
               </w:rPr>
-              <w:t>Quercus robur L.</w:t>
+              <w:t xml:space="preserve">Quercus </w:t>
+            </w:r>
+            <w:proofErr w:type="spellStart"/>
+            <w:r>
+              <w:rPr>
+                <w:rFonts w:ascii="Arial" w:hAnsi="Arial" w:cs="Arial"/>
+                <w:i/>
+                <w:iCs/>
+                <w:sz w:val="16"/>
+                <w:szCs w:val="16"/>
+                <w:lang w:val="es-ES_tradnl"/>
+              </w:rPr>
+              <w:t>robur</w:t>
+            </w:r>
+            <w:proofErr w:type="spellEnd"/>
+            <w:r>
+              <w:rPr>
+                <w:rFonts w:ascii="Arial" w:hAnsi="Arial" w:cs="Arial"/>
+                <w:i/>
+                <w:iCs/>
+                <w:sz w:val="16"/>
+                <w:szCs w:val="16"/>
+                <w:lang w:val="es-ES_tradnl"/>
+              </w:rPr>
+              <w:t xml:space="preserve"> L.</w:t>
             </w:r>
           </w:p>
         </w:tc>
@@ -597,7 +659,31 @@
                 <w:szCs w:val="16"/>
                 <w:lang w:val="es-ES_tradnl"/>
               </w:rPr>
-              <w:t>Quercus ilex. L</w:t>
+              <w:t xml:space="preserve">Quercus </w:t>
+            </w:r>
+            <w:proofErr w:type="spellStart"/>
+            <w:r>
+              <w:rPr>
+                <w:rFonts w:ascii="Arial" w:hAnsi="Arial" w:cs="Arial"/>
+                <w:i/>
+                <w:iCs/>
+                <w:sz w:val="16"/>
+                <w:szCs w:val="16"/>
+                <w:lang w:val="es-ES_tradnl"/>
+              </w:rPr>
+              <w:t>ilex</w:t>
+            </w:r>
+            <w:proofErr w:type="spellEnd"/>
+            <w:r>
+              <w:rPr>
+                <w:rFonts w:ascii="Arial" w:hAnsi="Arial" w:cs="Arial"/>
+                <w:i/>
+                <w:iCs/>
+                <w:sz w:val="16"/>
+                <w:szCs w:val="16"/>
+                <w:lang w:val="es-ES_tradnl"/>
+              </w:rPr>
+              <w:t>. L</w:t>
             </w:r>
           </w:p>
         </w:tc>
@@ -636,13 +722,23 @@
                 <w:szCs w:val="16"/>
               </w:rPr>
             </w:pPr>
-            <w:r>
-              <w:rPr>
-                <w:rFonts w:ascii="Arial" w:hAnsi="Arial" w:cs="Arial"/>
-                <w:sz w:val="16"/>
-                <w:szCs w:val="16"/>
-              </w:rPr>
-              <w:t>Archaeological site</w:t>
+            <w:proofErr w:type="spellStart"/>
+            <w:r>
+              <w:rPr>
+                <w:rFonts w:ascii="Arial" w:hAnsi="Arial" w:cs="Arial"/>
+                <w:sz w:val="16"/>
+                <w:szCs w:val="16"/>
+              </w:rPr>
+              <w:t>Archaeological</w:t>
+            </w:r>
+            <w:proofErr w:type="spellEnd"/>
+            <w:r>
+              <w:rPr>
+                <w:rFonts w:ascii="Arial" w:hAnsi="Arial" w:cs="Arial"/>
+                <w:sz w:val="16"/>
+                <w:szCs w:val="16"/>
+              </w:rPr>
+              <w:t xml:space="preserve"> site</w:t>
             </w:r>
           </w:p>
         </w:tc>
@@ -688,6 +784,7 @@
                 <w:szCs w:val="16"/>
               </w:rPr>
             </w:pPr>
+            <w:proofErr w:type="spellStart"/>
             <w:r>
               <w:rPr>
                 <w:rFonts w:ascii="Arial" w:hAnsi="Arial" w:cs="Arial"/>
@@ -697,7 +794,19 @@
                 <w:szCs w:val="16"/>
                 <w:lang w:val="es-ES_tradnl"/>
               </w:rPr>
-              <w:t>Corylus avellana L.</w:t>
+              <w:t>Corylus</w:t>
+            </w:r>
+            <w:proofErr w:type="spellEnd"/>
+            <w:r>
+              <w:rPr>
+                <w:rFonts w:ascii="Arial" w:hAnsi="Arial" w:cs="Arial"/>
+                <w:i/>
+                <w:iCs/>
+                <w:sz w:val="16"/>
+                <w:szCs w:val="16"/>
+                <w:lang w:val="es-ES_tradnl"/>
+              </w:rPr>
+              <w:t xml:space="preserve"> avellana L.</w:t>
             </w:r>
           </w:p>
         </w:tc>
@@ -737,6 +846,7 @@
                 <w:lang w:val="en-US"/>
               </w:rPr>
             </w:pPr>
+            <w:proofErr w:type="spellStart"/>
             <w:r>
               <w:rPr>
                 <w:rFonts w:ascii="Arial" w:hAnsi="Arial" w:cs="Arial"/>
@@ -744,7 +854,17 @@
                 <w:szCs w:val="16"/>
                 <w:lang w:val="en-US"/>
               </w:rPr>
-              <w:t>Paleoambiental study and archaeological site</w:t>
+              <w:t>Paleoambiental</w:t>
+            </w:r>
+            <w:proofErr w:type="spellEnd"/>
+            <w:r>
+              <w:rPr>
+                <w:rFonts w:ascii="Arial" w:hAnsi="Arial" w:cs="Arial"/>
+                <w:sz w:val="16"/>
+                <w:szCs w:val="16"/>
+                <w:lang w:val="en-US"/>
+              </w:rPr>
+              <w:t xml:space="preserve"> study and archaeological site</w:t>
             </w:r>
           </w:p>
         </w:tc>
@@ -766,7 +886,25 @@
                 <w:sz w:val="16"/>
                 <w:szCs w:val="16"/>
               </w:rPr>
-              <w:t>Ramil Rego, Fernández 1996; Gómez Orellana et al. 2001</w:t>
+              <w:t xml:space="preserve">Ramil Rego, </w:t>
+            </w:r>
+            <w:proofErr w:type="spellStart"/>
+            <w:r>
+              <w:rPr>
+                <w:rFonts w:ascii="Arial" w:hAnsi="Arial" w:cs="Arial"/>
+                <w:sz w:val="16"/>
+                <w:szCs w:val="16"/>
+              </w:rPr>
+              <w:t>Fernández</w:t>
+            </w:r>
+            <w:proofErr w:type="spellEnd"/>
+            <w:r>
+              <w:rPr>
+                <w:rFonts w:ascii="Arial" w:hAnsi="Arial" w:cs="Arial"/>
+                <w:sz w:val="16"/>
+                <w:szCs w:val="16"/>
+              </w:rPr>
+              <w:t xml:space="preserve"> 1996; Gómez Orellana et al. 2001</w:t>
             </w:r>
           </w:p>
           <w:p>
@@ -799,15 +937,49 @@
                 <w:szCs w:val="16"/>
               </w:rPr>
             </w:pPr>
-            <w:r>
-              <w:rPr>
-                <w:rFonts w:ascii="Arial" w:hAnsi="Arial" w:cs="Arial"/>
-                <w:i/>
-                <w:iCs/>
-                <w:sz w:val="16"/>
-                <w:szCs w:val="16"/>
-              </w:rPr>
-              <w:t>Taxus baccata L.</w:t>
+            <w:proofErr w:type="spellStart"/>
+            <w:r>
+              <w:rPr>
+                <w:rFonts w:ascii="Arial" w:hAnsi="Arial" w:cs="Arial"/>
+                <w:i/>
+                <w:iCs/>
+                <w:sz w:val="16"/>
+                <w:szCs w:val="16"/>
+              </w:rPr>
+              <w:t>Taxus</w:t>
+            </w:r>
+            <w:proofErr w:type="spellEnd"/>
+            <w:r>
+              <w:rPr>
+                <w:rFonts w:ascii="Arial" w:hAnsi="Arial" w:cs="Arial"/>
+                <w:i/>
+                <w:iCs/>
+                <w:sz w:val="16"/>
+                <w:szCs w:val="16"/>
+              </w:rPr>
+              <w:t xml:space="preserve"> </w:t>
+            </w:r>
+            <w:proofErr w:type="spellStart"/>
+            <w:r>
+              <w:rPr>
+                <w:rFonts w:ascii="Arial" w:hAnsi="Arial" w:cs="Arial"/>
+                <w:i/>
+                <w:iCs/>
+                <w:sz w:val="16"/>
+                <w:szCs w:val="16"/>
+              </w:rPr>
+              <w:t>baccata</w:t>
+            </w:r>
+            <w:proofErr w:type="spellEnd"/>
+            <w:r>
+              <w:rPr>
+                <w:rFonts w:ascii="Arial" w:hAnsi="Arial" w:cs="Arial"/>
+                <w:i/>
+                <w:iCs/>
+                <w:sz w:val="16"/>
+                <w:szCs w:val="16"/>
+              </w:rPr>
+              <w:t xml:space="preserve"> L.</w:t>
             </w:r>
           </w:p>
         </w:tc>
@@ -852,8 +1024,18 @@
                 <w:sz w:val="16"/>
                 <w:szCs w:val="16"/>
               </w:rPr>
-              <w:t>Paleoambiental study</w:t>
-            </w:r>
+              <w:t xml:space="preserve">Paleoambiental </w:t>
+            </w:r>
+            <w:proofErr w:type="spellStart"/>
+            <w:r>
+              <w:rPr>
+                <w:rFonts w:ascii="Arial" w:hAnsi="Arial" w:cs="Arial"/>
+                <w:sz w:val="16"/>
+                <w:szCs w:val="16"/>
+              </w:rPr>
+              <w:t>study</w:t>
+            </w:r>
+            <w:proofErr w:type="spellEnd"/>
           </w:p>
         </w:tc>
         <w:tc>
@@ -898,16 +1080,40 @@
                 <w:szCs w:val="16"/>
               </w:rPr>
             </w:pPr>
-            <w:r>
-              <w:rPr>
-                <w:rFonts w:ascii="Arial" w:hAnsi="Arial" w:cs="Arial"/>
-                <w:i/>
-                <w:iCs/>
-                <w:sz w:val="16"/>
-                <w:szCs w:val="16"/>
-              </w:rPr>
-              <w:t>Pinus sylvestris</w:t>
-            </w:r>
+            <w:proofErr w:type="spellStart"/>
+            <w:r>
+              <w:rPr>
+                <w:rFonts w:ascii="Arial" w:hAnsi="Arial" w:cs="Arial"/>
+                <w:i/>
+                <w:iCs/>
+                <w:sz w:val="16"/>
+                <w:szCs w:val="16"/>
+              </w:rPr>
+              <w:t>Pinus</w:t>
+            </w:r>
+            <w:proofErr w:type="spellEnd"/>
+            <w:r>
+              <w:rPr>
+                <w:rFonts w:ascii="Arial" w:hAnsi="Arial" w:cs="Arial"/>
+                <w:i/>
+                <w:iCs/>
+                <w:sz w:val="16"/>
+                <w:szCs w:val="16"/>
+              </w:rPr>
+              <w:t xml:space="preserve"> </w:t>
+            </w:r>
+            <w:proofErr w:type="spellStart"/>
+            <w:r>
+              <w:rPr>
+                <w:rFonts w:ascii="Arial" w:hAnsi="Arial" w:cs="Arial"/>
+                <w:i/>
+                <w:iCs/>
+                <w:sz w:val="16"/>
+                <w:szCs w:val="16"/>
+              </w:rPr>
+              <w:t>sylvestris</w:t>
+            </w:r>
+            <w:proofErr w:type="spellEnd"/>
           </w:p>
         </w:tc>
         <w:tc>
@@ -951,8 +1157,18 @@
                 <w:sz w:val="16"/>
                 <w:szCs w:val="16"/>
               </w:rPr>
-              <w:t>Paleoambiental study</w:t>
-            </w:r>
+              <w:t xml:space="preserve">Paleoambiental </w:t>
+            </w:r>
+            <w:proofErr w:type="spellStart"/>
+            <w:r>
+              <w:rPr>
+                <w:rFonts w:ascii="Arial" w:hAnsi="Arial" w:cs="Arial"/>
+                <w:sz w:val="16"/>
+                <w:szCs w:val="16"/>
+              </w:rPr>
+              <w:t>study</w:t>
+            </w:r>
+            <w:proofErr w:type="spellEnd"/>
           </w:p>
         </w:tc>
         <w:tc>
@@ -973,7 +1189,25 @@
                 <w:sz w:val="16"/>
                 <w:szCs w:val="16"/>
               </w:rPr>
-              <w:t>Pérez Díaz, López Sáez, Lestón Gómez 2016</w:t>
+              <w:t xml:space="preserve">Pérez Díaz, López Sáez, </w:t>
+            </w:r>
+            <w:proofErr w:type="spellStart"/>
+            <w:r>
+              <w:rPr>
+                <w:rFonts w:ascii="Arial" w:hAnsi="Arial" w:cs="Arial"/>
+                <w:sz w:val="16"/>
+                <w:szCs w:val="16"/>
+              </w:rPr>
+              <w:t>Lestón</w:t>
+            </w:r>
+            <w:proofErr w:type="spellEnd"/>
+            <w:r>
+              <w:rPr>
+                <w:rFonts w:ascii="Arial" w:hAnsi="Arial" w:cs="Arial"/>
+                <w:sz w:val="16"/>
+                <w:szCs w:val="16"/>
+              </w:rPr>
+              <w:t xml:space="preserve"> Gómez 2016</w:t>
             </w:r>
           </w:p>
         </w:tc>
@@ -1005,7 +1239,29 @@
                 <w:sz w:val="16"/>
                 <w:szCs w:val="16"/>
               </w:rPr>
-              <w:t>Alnus sp.</w:t>
+              <w:t xml:space="preserve">Alnus </w:t>
+            </w:r>
+            <w:proofErr w:type="spellStart"/>
+            <w:r>
+              <w:rPr>
+                <w:rFonts w:ascii="Arial" w:hAnsi="Arial" w:cs="Arial"/>
+                <w:i/>
+                <w:iCs/>
+                <w:sz w:val="16"/>
+                <w:szCs w:val="16"/>
+              </w:rPr>
+              <w:t>sp</w:t>
+            </w:r>
+            <w:proofErr w:type="spellEnd"/>
+            <w:r>
+              <w:rPr>
+                <w:rFonts w:ascii="Arial" w:hAnsi="Arial" w:cs="Arial"/>
+                <w:i/>
+                <w:iCs/>
+                <w:sz w:val="16"/>
+                <w:szCs w:val="16"/>
+              </w:rPr>
+              <w:t>.</w:t>
             </w:r>
           </w:p>
         </w:tc>
@@ -1050,8 +1306,18 @@
                 <w:sz w:val="16"/>
                 <w:szCs w:val="16"/>
               </w:rPr>
-              <w:t>Paleoambiental study</w:t>
-            </w:r>
+              <w:t xml:space="preserve">Paleoambiental </w:t>
+            </w:r>
+            <w:proofErr w:type="spellStart"/>
+            <w:r>
+              <w:rPr>
+                <w:rFonts w:ascii="Arial" w:hAnsi="Arial" w:cs="Arial"/>
+                <w:sz w:val="16"/>
+                <w:szCs w:val="16"/>
+              </w:rPr>
+              <w:t>study</w:t>
+            </w:r>
+            <w:proofErr w:type="spellEnd"/>
           </w:p>
         </w:tc>
         <w:tc>
@@ -1072,7 +1338,25 @@
                 <w:sz w:val="16"/>
                 <w:szCs w:val="16"/>
               </w:rPr>
-              <w:t>Pérez Díaz, López Sáez, Lestón Gómez 2016</w:t>
+              <w:t xml:space="preserve">Pérez Díaz, López Sáez, </w:t>
+            </w:r>
+            <w:proofErr w:type="spellStart"/>
+            <w:r>
+              <w:rPr>
+                <w:rFonts w:ascii="Arial" w:hAnsi="Arial" w:cs="Arial"/>
+                <w:sz w:val="16"/>
+                <w:szCs w:val="16"/>
+              </w:rPr>
+              <w:t>Lestón</w:t>
+            </w:r>
+            <w:proofErr w:type="spellEnd"/>
+            <w:r>
+              <w:rPr>
+                <w:rFonts w:ascii="Arial" w:hAnsi="Arial" w:cs="Arial"/>
+                <w:sz w:val="16"/>
+                <w:szCs w:val="16"/>
+              </w:rPr>
+              <w:t xml:space="preserve"> Gómez 2016</w:t>
             </w:r>
           </w:p>
         </w:tc>
@@ -1104,7 +1388,29 @@
                 <w:sz w:val="16"/>
                 <w:szCs w:val="16"/>
               </w:rPr>
-              <w:t>Salix sp.</w:t>
+              <w:t xml:space="preserve">Salix </w:t>
+            </w:r>
+            <w:proofErr w:type="spellStart"/>
+            <w:r>
+              <w:rPr>
+                <w:rFonts w:ascii="Arial" w:hAnsi="Arial" w:cs="Arial"/>
+                <w:i/>
+                <w:iCs/>
+                <w:sz w:val="16"/>
+                <w:szCs w:val="16"/>
+              </w:rPr>
+              <w:t>sp</w:t>
+            </w:r>
+            <w:proofErr w:type="spellEnd"/>
+            <w:r>
+              <w:rPr>
+                <w:rFonts w:ascii="Arial" w:hAnsi="Arial" w:cs="Arial"/>
+                <w:i/>
+                <w:iCs/>
+                <w:sz w:val="16"/>
+                <w:szCs w:val="16"/>
+              </w:rPr>
+              <w:t>.</w:t>
             </w:r>
           </w:p>
         </w:tc>
@@ -1144,6 +1450,7 @@
                 <w:lang w:val="en-US"/>
               </w:rPr>
             </w:pPr>
+            <w:proofErr w:type="spellStart"/>
             <w:r>
               <w:rPr>
                 <w:rFonts w:ascii="Arial" w:hAnsi="Arial" w:cs="Arial"/>
@@ -1151,7 +1458,17 @@
                 <w:szCs w:val="16"/>
                 <w:lang w:val="en-US"/>
               </w:rPr>
-              <w:t>Paleoambiental study and archaeological site</w:t>
+              <w:t>Paleoambiental</w:t>
+            </w:r>
+            <w:proofErr w:type="spellEnd"/>
+            <w:r>
+              <w:rPr>
+                <w:rFonts w:ascii="Arial" w:hAnsi="Arial" w:cs="Arial"/>
+                <w:sz w:val="16"/>
+                <w:szCs w:val="16"/>
+                <w:lang w:val="en-US"/>
+              </w:rPr>
+              <w:t xml:space="preserve"> study and archaeological site</w:t>
             </w:r>
           </w:p>
         </w:tc>
@@ -1173,7 +1490,25 @@
                 <w:sz w:val="16"/>
                 <w:szCs w:val="16"/>
               </w:rPr>
-              <w:t>Ramil Rego, Fernández 1996; Gómez Orellana et al. 2001</w:t>
+              <w:t xml:space="preserve">Ramil Rego, </w:t>
+            </w:r>
+            <w:proofErr w:type="spellStart"/>
+            <w:r>
+              <w:rPr>
+                <w:rFonts w:ascii="Arial" w:hAnsi="Arial" w:cs="Arial"/>
+                <w:sz w:val="16"/>
+                <w:szCs w:val="16"/>
+              </w:rPr>
+              <w:t>Fernández</w:t>
+            </w:r>
+            <w:proofErr w:type="spellEnd"/>
+            <w:r>
+              <w:rPr>
+                <w:rFonts w:ascii="Arial" w:hAnsi="Arial" w:cs="Arial"/>
+                <w:sz w:val="16"/>
+                <w:szCs w:val="16"/>
+              </w:rPr>
+              <w:t xml:space="preserve"> 1996; Gómez Orellana et al. 2001</w:t>
             </w:r>
           </w:p>
           <w:p>
@@ -1206,6 +1541,7 @@
                 <w:szCs w:val="16"/>
               </w:rPr>
             </w:pPr>
+            <w:proofErr w:type="spellStart"/>
             <w:r>
               <w:rPr>
                 <w:rFonts w:ascii="Arial" w:hAnsi="Arial" w:cs="Arial"/>
@@ -1215,7 +1551,40 @@
                 <w:szCs w:val="16"/>
               </w:rPr>
               <w:lastRenderedPageBreak/>
-              <w:t>Betula sp.</w:t>
+              <w:t>Betula</w:t>
+            </w:r>
+            <w:proofErr w:type="spellEnd"/>
+            <w:r>
+              <w:rPr>
+                <w:rFonts w:ascii="Arial" w:hAnsi="Arial" w:cs="Arial"/>
+                <w:i/>
+                <w:iCs/>
+                <w:sz w:val="16"/>
+                <w:szCs w:val="16"/>
+              </w:rPr>
+              <w:t xml:space="preserve"> </w:t>
+            </w:r>
+            <w:proofErr w:type="spellStart"/>
+            <w:r>
+              <w:rPr>
+                <w:rFonts w:ascii="Arial" w:hAnsi="Arial" w:cs="Arial"/>
+                <w:i/>
+                <w:iCs/>
+                <w:sz w:val="16"/>
+                <w:szCs w:val="16"/>
+              </w:rPr>
+              <w:t>sp</w:t>
+            </w:r>
+            <w:proofErr w:type="spellEnd"/>
+            <w:r>
+              <w:rPr>
+                <w:rFonts w:ascii="Arial" w:hAnsi="Arial" w:cs="Arial"/>
+                <w:i/>
+                <w:iCs/>
+                <w:sz w:val="16"/>
+                <w:szCs w:val="16"/>
+              </w:rPr>
+              <w:t>.</w:t>
             </w:r>
           </w:p>
         </w:tc>
@@ -1260,8 +1629,18 @@
                 <w:sz w:val="16"/>
                 <w:szCs w:val="16"/>
               </w:rPr>
-              <w:t>Paleoambiental study</w:t>
-            </w:r>
+              <w:t xml:space="preserve">Paleoambiental </w:t>
+            </w:r>
+            <w:proofErr w:type="spellStart"/>
+            <w:r>
+              <w:rPr>
+                <w:rFonts w:ascii="Arial" w:hAnsi="Arial" w:cs="Arial"/>
+                <w:sz w:val="16"/>
+                <w:szCs w:val="16"/>
+              </w:rPr>
+              <w:t>study</w:t>
+            </w:r>
+            <w:proofErr w:type="spellEnd"/>
           </w:p>
         </w:tc>
         <w:tc>
@@ -1282,7 +1661,25 @@
                 <w:sz w:val="16"/>
                 <w:szCs w:val="16"/>
               </w:rPr>
-              <w:t>Pérez Díaz, López Sáez, Lestón Gómez 2016</w:t>
+              <w:t xml:space="preserve">Pérez Díaz, López Sáez, </w:t>
+            </w:r>
+            <w:proofErr w:type="spellStart"/>
+            <w:r>
+              <w:rPr>
+                <w:rFonts w:ascii="Arial" w:hAnsi="Arial" w:cs="Arial"/>
+                <w:sz w:val="16"/>
+                <w:szCs w:val="16"/>
+              </w:rPr>
+              <w:t>Lestón</w:t>
+            </w:r>
+            <w:proofErr w:type="spellEnd"/>
+            <w:r>
+              <w:rPr>
+                <w:rFonts w:ascii="Arial" w:hAnsi="Arial" w:cs="Arial"/>
+                <w:sz w:val="16"/>
+                <w:szCs w:val="16"/>
+              </w:rPr>
+              <w:t xml:space="preserve"> Gómez 2016</w:t>
             </w:r>
           </w:p>
         </w:tc>
@@ -1306,6 +1703,7 @@
                 <w:szCs w:val="16"/>
               </w:rPr>
             </w:pPr>
+            <w:proofErr w:type="spellStart"/>
             <w:r>
               <w:rPr>
                 <w:rFonts w:ascii="Arial" w:hAnsi="Arial" w:cs="Arial"/>
@@ -1316,6 +1714,7 @@
               </w:rPr>
               <w:t>Poaceae</w:t>
             </w:r>
+            <w:proofErr w:type="spellEnd"/>
           </w:p>
         </w:tc>
         <w:tc>
@@ -1361,8 +1760,18 @@
                 <w:sz w:val="16"/>
                 <w:szCs w:val="16"/>
               </w:rPr>
-              <w:t>Paleoambiental study</w:t>
-            </w:r>
+              <w:t xml:space="preserve">Paleoambiental </w:t>
+            </w:r>
+            <w:proofErr w:type="spellStart"/>
+            <w:r>
+              <w:rPr>
+                <w:rFonts w:ascii="Arial" w:hAnsi="Arial" w:cs="Arial"/>
+                <w:sz w:val="16"/>
+                <w:szCs w:val="16"/>
+              </w:rPr>
+              <w:t>study</w:t>
+            </w:r>
+            <w:proofErr w:type="spellEnd"/>
           </w:p>
         </w:tc>
         <w:tc>
@@ -1383,7 +1792,25 @@
                 <w:sz w:val="16"/>
                 <w:szCs w:val="16"/>
               </w:rPr>
-              <w:t>Pérez Díaz, López Sáez, Lestón Gómez 2016</w:t>
+              <w:t xml:space="preserve">Pérez Díaz, López Sáez, </w:t>
+            </w:r>
+            <w:proofErr w:type="spellStart"/>
+            <w:r>
+              <w:rPr>
+                <w:rFonts w:ascii="Arial" w:hAnsi="Arial" w:cs="Arial"/>
+                <w:sz w:val="16"/>
+                <w:szCs w:val="16"/>
+              </w:rPr>
+              <w:t>Lestón</w:t>
+            </w:r>
+            <w:proofErr w:type="spellEnd"/>
+            <w:r>
+              <w:rPr>
+                <w:rFonts w:ascii="Arial" w:hAnsi="Arial" w:cs="Arial"/>
+                <w:sz w:val="16"/>
+                <w:szCs w:val="16"/>
+              </w:rPr>
+              <w:t xml:space="preserve"> Gómez 2016</w:t>
             </w:r>
           </w:p>
         </w:tc>
@@ -1478,6 +1905,8 @@
         <w:jc w:val="both"/>
         <w:rPr>
           <w:rFonts w:ascii="Arial" w:hAnsi="Arial" w:cs="Arial"/>
+          <w:b/>
+          <w:bCs/>
           <w:sz w:val="24"/>
           <w:szCs w:val="24"/>
           <w:lang w:val="en-GB"/>
@@ -1490,97 +1919,7 @@
           <w:szCs w:val="24"/>
           <w:lang w:val="en-GB"/>
         </w:rPr>
-        <w:t>For each evaluated region (Duero basins, Tagus basins, and South), three models are compared: 1</w:t>
-      </w:r>
-      <w:r>
-        <w:rPr>
-          <w:rFonts w:ascii="Arial" w:hAnsi="Arial" w:cs="Arial"/>
-          <w:sz w:val="24"/>
-          <w:szCs w:val="24"/>
-          <w:lang w:val="en-GB"/>
-        </w:rPr>
-        <w:t>) A</w:t>
-      </w:r>
-      <w:r>
-        <w:rPr>
-          <w:rFonts w:ascii="Arial" w:hAnsi="Arial" w:cs="Arial"/>
-          <w:sz w:val="24"/>
-          <w:szCs w:val="24"/>
-          <w:lang w:val="en-GB"/>
-        </w:rPr>
-        <w:t>ll chamber samples</w:t>
-      </w:r>
-      <w:r>
-        <w:rPr>
-          <w:rFonts w:ascii="Arial" w:hAnsi="Arial" w:cs="Arial"/>
-          <w:sz w:val="24"/>
-          <w:szCs w:val="24"/>
-          <w:lang w:val="en-GB"/>
-        </w:rPr>
-        <w:t xml:space="preserve">; </w:t>
-      </w:r>
-      <w:r>
-        <w:rPr>
-          <w:rFonts w:ascii="Arial" w:hAnsi="Arial" w:cs="Arial"/>
-          <w:sz w:val="24"/>
-          <w:szCs w:val="24"/>
-          <w:lang w:val="en-GB"/>
-        </w:rPr>
-        <w:t>2) Charcoal in chamber</w:t>
-      </w:r>
-      <w:r>
-        <w:rPr>
-          <w:rFonts w:ascii="Arial" w:hAnsi="Arial" w:cs="Arial"/>
-          <w:sz w:val="24"/>
-          <w:szCs w:val="24"/>
-          <w:lang w:val="en-GB"/>
-        </w:rPr>
-        <w:t xml:space="preserve">; </w:t>
-      </w:r>
-      <w:r>
-        <w:rPr>
-          <w:rFonts w:ascii="Arial" w:hAnsi="Arial" w:cs="Arial"/>
-          <w:sz w:val="24"/>
-          <w:szCs w:val="24"/>
-          <w:lang w:val="en-GB"/>
-        </w:rPr>
-        <w:t>and 3)</w:t>
-      </w:r>
-      <w:r>
-        <w:rPr>
-          <w:rFonts w:ascii="Arial" w:hAnsi="Arial" w:cs="Arial"/>
-          <w:sz w:val="24"/>
-          <w:szCs w:val="24"/>
-          <w:lang w:val="en-GB"/>
-        </w:rPr>
-        <w:t xml:space="preserve"> H</w:t>
-      </w:r>
-      <w:r>
-        <w:rPr>
-          <w:rFonts w:ascii="Arial" w:hAnsi="Arial" w:cs="Arial"/>
-          <w:sz w:val="24"/>
-          <w:szCs w:val="24"/>
-          <w:lang w:val="en-GB"/>
-        </w:rPr>
-        <w:t>uman bone/teeth in chamber.</w:t>
-      </w:r>
-      <w:r>
-        <w:rPr>
-          <w:rFonts w:ascii="Arial" w:hAnsi="Arial" w:cs="Arial"/>
-          <w:sz w:val="24"/>
-          <w:szCs w:val="24"/>
-          <w:lang w:val="en-GB"/>
-        </w:rPr>
-        <w:t xml:space="preserve"> </w:t>
-      </w:r>
-      <w:r>
-        <w:rPr>
-          <w:rFonts w:ascii="Arial" w:hAnsi="Arial" w:cs="Arial"/>
-          <w:sz w:val="24"/>
-          <w:szCs w:val="24"/>
-          <w:lang w:val="en-GB"/>
-        </w:rPr>
-        <w:t>Horizontal bars represent the 95% (thin outer rectangle) and 50% (thick inner rectangle) highest posterior density intervals (HPDI), respectively, while vertical grey lines indicate posterior medians estimated from 100,000 MCMC samples.</w:t>
+        <w:t>For each evaluated region (Duero basins, Tagus basins, and South), three models are compared: 1) All chamber samples (Chamber Combined); 2) Charcoal in chamber (Chamber Charcoal); and 3) Human bone and teeth in chamber (Chamber Bone/teeth). Horizontal bars represent the 95% (thin outer rectangle) and 50% (thick inner rectangle) highest posterior density intervals (HPDI), respectively, while vertical grey lines indicate posterior medians estimated from 100,000 MCMC samples.</w:t>
       </w:r>
     </w:p>
     <w:p>
@@ -1604,10 +1943,10 @@
           <w:lang w:val="en-GB"/>
         </w:rPr>
         <w:drawing>
-          <wp:inline distT="0" distB="0" distL="0" distR="0" wp14:anchorId="251932B8" wp14:editId="1A483D7C">
-            <wp:extent cx="5396230" cy="4048125"/>
+          <wp:inline distT="0" distB="0" distL="0" distR="0" wp14:anchorId="5D063930" wp14:editId="3BFCCB45">
+            <wp:extent cx="5391150" cy="4048125"/>
             <wp:effectExtent l="0" t="0" r="0" b="9525"/>
-            <wp:docPr id="1231410596" name="Imagen 1"/>
+            <wp:docPr id="441504338" name="Imagen 1"/>
             <wp:cNvGraphicFramePr>
               <a:graphicFrameLocks xmlns:a="http://schemas.openxmlformats.org/drawingml/2006/main" noChangeAspect="1"/>
             </wp:cNvGraphicFramePr>
@@ -1636,7 +1975,7 @@
                   <pic:spPr bwMode="auto">
                     <a:xfrm>
                       <a:off x="0" y="0"/>
-                      <a:ext cx="5396230" cy="4048125"/>
+                      <a:ext cx="5391150" cy="4048125"/>
                     </a:xfrm>
                     <a:prstGeom prst="rect">
                       <a:avLst/>

</xml_diff>